<commit_message>
feat(administrativo): Módulo Talento Humano y Master Data (Etapas 1-6)
- Etapa 1: Esquema Relacional Base (Direccion, Unidad, Personal) y Enums (LOEP, Código Trabajo).
- Etapa 2: CRUD y Esquemas Pydantic / Rutas FastAPI independientes.
- Etapa 3: UI Frontend con Smart Modals (Direcciones, Unidades, Personal) y DataGrids MUI.
- Etapa 4: UX Premium, carga de foto_perfil (Avatar Base64) y vinculación de Personal-Usuarios.
- Etapa 5: Expansión de Perfil con Tabs (Datos, Contacto, Firma Electrónica p12, Formación Académica/Títulos).
- Etapa 6: Integración 'Autocompletado Inteligente' en Módulo Contratación consumiendo /personal/me.
</commit_message>
<xml_diff>
--- a/backend/templates/contratacion/8_1_Formulario_Certificación_de_Catálogo_Electrónico_v1_1772944259.docx
+++ b/backend/templates/contratacion/8_1_Formulario_Certificación_de_Catálogo_Electrónico_v1_1772944259.docx
@@ -2325,7 +2325,7 @@
           <w:spacing w:val="-1"/>
           <w:lang w:val="es-EC"/>
         </w:rPr>
-        <w:t>{% p for bien in lista_bienes %}</w:t>
+        <w:t>{%p for bien in lista_bienes %}</w:t>
       </w:r>
     </w:p>
     <w:p>
@@ -2480,7 +2480,7 @@
           <w:spacing w:val="-1"/>
           <w:lang w:val="es-EC"/>
         </w:rPr>
-        <w:t>{% p endfor %}</w:t>
+        <w:t>{%p endfor %}</w:t>
       </w:r>
     </w:p>
     <w:p>
@@ -5517,7 +5517,6 @@
   <w:style w:type="character" w:default="1" w:styleId="Fuentedeprrafopredeter">
     <w:name w:val="Default Paragraph Font"/>
     <w:uiPriority w:val="1"/>
-    <w:semiHidden/>
     <w:unhideWhenUsed/>
   </w:style>
   <w:style w:type="table" w:default="1" w:styleId="Tablanormal">
@@ -5917,6 +5916,7 @@
     <w:rsid w:val="001B2985"/>
     <w:rsid w:val="001F09E0"/>
     <w:rsid w:val="002957FA"/>
+    <w:rsid w:val="00693F7F"/>
     <w:rsid w:val="006D5960"/>
     <w:rsid w:val="007011F8"/>
     <w:rsid w:val="008E0B3E"/>

</xml_diff>